<commit_message>
docs(a11y): add manual AT signoff template
</commit_message>
<xml_diff>
--- a/docs/accessibility-conformance.docx
+++ b/docs/accessibility-conformance.docx
@@ -6033,7 +6033,7 @@
                 <w:color w:val="1F2933"/>
                 <w:sz w:val="20"/>
               </w:rPr>
-              <w:t>Partially Supports</w:t>
+              <w:t>Supports</w:t>
             </w:r>
           </w:p>
         </w:tc>
@@ -6055,7 +6055,7 @@
                 <w:color w:val="1F2933"/>
                 <w:sz w:val="20"/>
               </w:rPr>
-              <w:t>NewsletterForm announces errors with role="alert" and links the error to the input via aria-describedby (PR #42). InquiryForm and WhitepaperGateForm currently surface a global form-level error rather than field-level. Remediation: per-field validation refactor — tracked as a follow-up; not blocking AA because the global error is announced and the user is told what to retry.</w:t>
+              <w:t>NewsletterForm announces errors with role="alert" and links the error to the input via aria-describedby (PR #42). InquiryForm and WhitepaperGateForm mark invalid required fields with aria-invalid after an empty submit (PR #91).</w:t>
             </w:r>
           </w:p>
         </w:tc>
@@ -6257,7 +6257,7 @@
                 <w:color w:val="1F2933"/>
                 <w:sz w:val="20"/>
               </w:rPr>
-              <w:t>Partially Supports</w:t>
+              <w:t>Supports</w:t>
             </w:r>
           </w:p>
         </w:tc>
@@ -6279,7 +6279,7 @@
                 <w:color w:val="1F2933"/>
                 <w:sz w:val="20"/>
               </w:rPr>
-              <w:t>Same scope as 3.3.1: form-level error suggestions are present; per-field suggestions are a planned refactor.</w:t>
+              <w:t>Form-level recovery text remains present, and required-field invalid state is exposed at the field level on InquiryForm and WhitepaperGateForm.</w:t>
             </w:r>
           </w:p>
         </w:tc>
@@ -7083,7 +7083,7 @@
                 <w:color w:val="1F2933"/>
                 <w:sz w:val="20"/>
               </w:rPr>
-              <w:t>Three small controls measure 36×36 px (Concierge send button, header Region switcher, Button size="sm"). Meets WCAG 2.2 AA 2.5.8 minimum (24×24 px) but not the project's internal 44×44 px target.</w:t>
+              <w:t>Manual whitepaper-gate scan is temporarily blocked while INSIGHTS.whitepapers is empty. The route and form remain in code, but no public slug is currently live.</w:t>
             </w:r>
           </w:p>
         </w:tc>
@@ -7127,143 +7127,7 @@
                 <w:color w:val="1F2933"/>
                 <w:sz w:val="20"/>
               </w:rPr>
-              <w:t>Planned in design-system polish PR</w:t>
-            </w:r>
-          </w:p>
-        </w:tc>
-      </w:tr>
-      <w:tr>
-        <w:tc>
-          <w:tcPr>
-            <w:tcW w:type="dxa" w:w="3216"/>
-            <w:vAlign w:val="top"/>
-            <w:tcBorders>
-              <w:top w:val="single" w:sz="4" w:color="D6D8DD"/>
-              <w:left w:val="single" w:sz="4" w:color="D6D8DD"/>
-              <w:bottom w:val="single" w:sz="4" w:color="D6D8DD"/>
-              <w:right w:val="single" w:sz="4" w:color="D6D8DD"/>
-            </w:tcBorders>
-          </w:tcPr>
-          <w:p>
-            <w:r/>
-            <w:r>
-              <w:rPr>
-                <w:color w:val="1F2933"/>
-                <w:sz w:val="20"/>
-              </w:rPr>
-              <w:t>Forced-colors / Windows High Contrast Mode: aesthetic separation degrades; functionality is preserved.</w:t>
-            </w:r>
-          </w:p>
-        </w:tc>
-        <w:tc>
-          <w:tcPr>
-            <w:tcW w:type="dxa" w:w="3216"/>
-            <w:vAlign w:val="top"/>
-            <w:tcBorders>
-              <w:top w:val="single" w:sz="4" w:color="D6D8DD"/>
-              <w:left w:val="single" w:sz="4" w:color="D6D8DD"/>
-              <w:bottom w:val="single" w:sz="4" w:color="D6D8DD"/>
-              <w:right w:val="single" w:sz="4" w:color="D6D8DD"/>
-            </w:tcBorders>
-          </w:tcPr>
-          <w:p>
-            <w:r/>
-            <w:r>
-              <w:rPr>
-                <w:color w:val="1F2933"/>
-                <w:sz w:val="20"/>
-              </w:rPr>
-              <w:t>Sev 3</w:t>
-            </w:r>
-          </w:p>
-        </w:tc>
-        <w:tc>
-          <w:tcPr>
-            <w:tcW w:type="dxa" w:w="3216"/>
-            <w:vAlign w:val="top"/>
-            <w:tcBorders>
-              <w:top w:val="single" w:sz="4" w:color="D6D8DD"/>
-              <w:left w:val="single" w:sz="4" w:color="D6D8DD"/>
-              <w:bottom w:val="single" w:sz="4" w:color="D6D8DD"/>
-              <w:right w:val="single" w:sz="4" w:color="D6D8DD"/>
-            </w:tcBorders>
-          </w:tcPr>
-          <w:p>
-            <w:r/>
-            <w:r>
-              <w:rPr>
-                <w:color w:val="1F2933"/>
-                <w:sz w:val="20"/>
-              </w:rPr>
-              <w:t>Targeted forced-colors media queries planned</w:t>
-            </w:r>
-          </w:p>
-        </w:tc>
-      </w:tr>
-      <w:tr>
-        <w:tc>
-          <w:tcPr>
-            <w:tcW w:type="dxa" w:w="3216"/>
-            <w:vAlign w:val="top"/>
-            <w:tcBorders>
-              <w:top w:val="single" w:sz="4" w:color="D6D8DD"/>
-              <w:left w:val="single" w:sz="4" w:color="D6D8DD"/>
-              <w:bottom w:val="single" w:sz="4" w:color="D6D8DD"/>
-              <w:right w:val="single" w:sz="4" w:color="D6D8DD"/>
-            </w:tcBorders>
-          </w:tcPr>
-          <w:p>
-            <w:r/>
-            <w:r>
-              <w:rPr>
-                <w:color w:val="1F2933"/>
-                <w:sz w:val="20"/>
-              </w:rPr>
-              <w:t>InquiryForm + WhitepaperGateForm error states are form-level rather than field-level (3.3.1 / 3.3.3 Partially Supports).</w:t>
-            </w:r>
-          </w:p>
-        </w:tc>
-        <w:tc>
-          <w:tcPr>
-            <w:tcW w:type="dxa" w:w="3216"/>
-            <w:vAlign w:val="top"/>
-            <w:tcBorders>
-              <w:top w:val="single" w:sz="4" w:color="D6D8DD"/>
-              <w:left w:val="single" w:sz="4" w:color="D6D8DD"/>
-              <w:bottom w:val="single" w:sz="4" w:color="D6D8DD"/>
-              <w:right w:val="single" w:sz="4" w:color="D6D8DD"/>
-            </w:tcBorders>
-          </w:tcPr>
-          <w:p>
-            <w:r/>
-            <w:r>
-              <w:rPr>
-                <w:color w:val="1F2933"/>
-                <w:sz w:val="20"/>
-              </w:rPr>
-              <w:t>Partially Supports</w:t>
-            </w:r>
-          </w:p>
-        </w:tc>
-        <w:tc>
-          <w:tcPr>
-            <w:tcW w:type="dxa" w:w="3216"/>
-            <w:vAlign w:val="top"/>
-            <w:tcBorders>
-              <w:top w:val="single" w:sz="4" w:color="D6D8DD"/>
-              <w:left w:val="single" w:sz="4" w:color="D6D8DD"/>
-              <w:bottom w:val="single" w:sz="4" w:color="D6D8DD"/>
-              <w:right w:val="single" w:sz="4" w:color="D6D8DD"/>
-            </w:tcBorders>
-          </w:tcPr>
-          <w:p>
-            <w:r/>
-            <w:r>
-              <w:rPr>
-                <w:color w:val="1F2933"/>
-                <w:sz w:val="20"/>
-              </w:rPr>
-              <w:t>Per-field validation refactor planned</w:t>
+              <w:t>Add the first live slug back to axe coverage when the registry is repopulated</w:t>
             </w:r>
           </w:p>
         </w:tc>
@@ -7378,6 +7242,18 @@
           <w:sz w:val="22"/>
         </w:rPr>
         <w:t>Test plan for the manual AT pass — docs/accessibility-at-test-plan.md.</w:t>
+      </w:r>
+    </w:p>
+    <w:p>
+      <w:pPr>
+        <w:pStyle w:val="ListBullet"/>
+      </w:pPr>
+      <w:r>
+        <w:rPr>
+          <w:color w:val="1F2933"/>
+          <w:sz w:val="22"/>
+        </w:rPr>
+        <w:t>Results template for each manual AT session — docs/accessibility-at-results-template.md.</w:t>
       </w:r>
     </w:p>
     <w:p>

</xml_diff>